<commit_message>
update phase 1 part 2
</commit_message>
<xml_diff>
--- a/files/Investment_Policy_Statement_Template_Client_Analysis_Framework.docx
+++ b/files/Investment_Policy_Statement_Template_Client_Analysis_Framework.docx
@@ -25,23 +25,13 @@
       </w:pPr>
       <w:bookmarkStart w:id="1" w:name="instructions-for-students"/>
       <w:r>
-        <w:t>This Investment Policy Statement (IPS) template is designed to help you translate your</w:t>
-      </w:r>
-      <w:r>
-        <w:t xml:space="preserve"> clients’</w:t>
-      </w:r>
-      <w:r>
-        <w:t xml:space="preserve"> risk aversion into a comprehensive investment policy. </w:t>
-      </w:r>
-      <w:r>
-        <w:t>U</w:t>
-      </w:r>
-      <w:r>
-        <w:t xml:space="preserve">se this template to create a formal IPS </w:t>
-      </w:r>
-      <w:r>
-        <w:t xml:space="preserve"> for your three respective clients.</w:t>
-      </w:r>
+        <w:t>Use this template to create one IPS for each of your three assigned fictional clients. Base each entry on the provided profile and data; label plausible scenario-based inferences as assumptions. No client interview is required.</w:t>
+      </w:r>
+      <w:r/>
+      <w:r/>
+      <w:r/>
+      <w:r/>
+      <w:r/>
     </w:p>
     <w:p>
       <w:pPr>
@@ -64,7 +54,7 @@
         </w:numPr>
       </w:pPr>
       <w:r>
-        <w:t>Select one client from your risk aversion analysis exercises</w:t>
+        <w:t>Create one copy for each of your three assigned fictional clients</w:t>
       </w:r>
     </w:p>
     <w:p>
@@ -76,7 +66,7 @@
         </w:numPr>
       </w:pPr>
       <w:r>
-        <w:t>Complete each section based on the client's profile and your analysis</w:t>
+        <w:t>Complete every substantive section from supplied facts or justified, labeled assumptions; mark unsupported exact values as not provided</w:t>
       </w:r>
     </w:p>
     <w:p>
@@ -88,7 +78,7 @@
         </w:numPr>
       </w:pPr>
       <w:r>
-        <w:t>Ensure consistency between risk assessment and investment recommendations</w:t>
+        <w:t>Keep objectives, risk limits, allocation, and implementation consistent with each scenario</w:t>
       </w:r>
     </w:p>
     <w:p>
@@ -100,7 +90,7 @@
         </w:numPr>
       </w:pPr>
       <w:r>
-        <w:t>Use professional language appropriate for client presentation</w:t>
+        <w:t>Use professional language and cite the assigned case for material facts</w:t>
       </w:r>
     </w:p>
     <w:p>
@@ -829,10 +819,10 @@
           <w:b/>
           <w:bCs/>
         </w:rPr>
-        <w:t>Client Statements Supporting Classification:</w:t>
-      </w:r>
-      <w:r>
-        <w:t xml:space="preserve"> "_________________________________________________"</w:t>
+        <w:t>Scenario Evidence Supporting Risk Classification:</w:t>
+      </w:r>
+      <w:r>
+        <w:t xml:space="preserve"> _____________________________________________</w:t>
       </w:r>
     </w:p>
     <w:p>
@@ -1271,15 +1261,15 @@
       </w:pPr>
       <w:bookmarkStart w:id="21" w:name="strategic-asset-allocation"/>
       <w:r>
-        <w:t>Strategic Asset Allocation</w:t>
-      </w:r>
-    </w:p>
-    <w:p>
-      <w:pPr>
-        <w:pStyle w:val="FirstParagraph"/>
-      </w:pPr>
-      <w:r>
-        <w:t>Based on the client's risk profile and objectives:</w:t>
+        <w:t>Provisional Strategic Asset Allocation</w:t>
+      </w:r>
+    </w:p>
+    <w:p>
+      <w:pPr>
+        <w:pStyle w:val="FirstParagraph"/>
+      </w:pPr>
+      <w:r>
+        <w:t>Propose policy-level weights from the scenario; sum to 100% and label inferred weights as assumptions:</w:t>
       </w:r>
     </w:p>
     <w:p>
@@ -1508,7 +1498,7 @@
           <w:b/>
           <w:bCs/>
         </w:rPr>
-        <w:t>Why this allocation is appropriate for this client:</w:t>
+        <w:t>Why this proposed allocation fits the client's goals, risk capacity, and constraints:</w:t>
       </w:r>
     </w:p>
     <w:p>
@@ -1905,7 +1895,7 @@
           <w:b/>
           <w:bCs/>
         </w:rPr>
-        <w:t>Phase 1 (Immediate - 0-30 days):</w:t>
+        <w:t>Immediate client implementation (0-30 days):</w:t>
       </w:r>
     </w:p>
     <w:p>
@@ -1931,7 +1921,7 @@
           <w:b/>
           <w:bCs/>
         </w:rPr>
-        <w:t>Phase 2 (Short-term - 1-6 months):</w:t>
+        <w:t>Short-term client implementation (1-6 months):</w:t>
       </w:r>
     </w:p>
     <w:p>
@@ -1957,7 +1947,7 @@
           <w:b/>
           <w:bCs/>
         </w:rPr>
-        <w:t>Phase 3 (Medium-term - 6-12 months):</w:t>
+        <w:t>Medium-term client implementation (6-12 months):</w:t>
       </w:r>
     </w:p>
     <w:p>
@@ -2182,7 +2172,7 @@
       <w:bookmarkEnd w:id="36"/>
       <w:bookmarkEnd w:id="38"/>
       <w:r>
-        <w:t>Section X: Client Acknowledgment</w:t>
+        <w:t>Section X: Simulation Review</w:t>
       </w:r>
     </w:p>
     <w:p>
@@ -2191,19 +2181,19 @@
       </w:pPr>
       <w:bookmarkStart w:id="40" w:name="understanding--agreement"/>
       <w:r>
-        <w:t>Understanding &amp; Agreement</w:t>
-      </w:r>
-    </w:p>
-    <w:p>
-      <w:pPr>
-        <w:pStyle w:val="FirstParagraph"/>
-      </w:pPr>
-      <w:r>
-        <w:rPr>
-          <w:b/>
-          <w:bCs/>
-        </w:rPr>
-        <w:t>Client Acknowledgment:</w:t>
+        <w:t>Assumptions and Signoff Status</w:t>
+      </w:r>
+    </w:p>
+    <w:p>
+      <w:pPr>
+        <w:pStyle w:val="FirstParagraph"/>
+      </w:pPr>
+      <w:r>
+        <w:rPr>
+          <w:b/>
+          <w:bCs/>
+        </w:rPr>
+        <w:t>For this class scenario:</w:t>
       </w:r>
     </w:p>
     <w:p>
@@ -2211,7 +2201,7 @@
         <w:pStyle w:val="BodyText"/>
       </w:pPr>
       <w:r>
-        <w:t>"I understand that this Investment Policy Statement reflects my current financial situation, investment objectives, and risk tolerance. I acknowledge that:</w:t>
+        <w:t>This IPS is based on supplied fictional client information and labeled assumptions. No client interview or signature is required. Record what would need confirmation before real implementation.</w:t>
       </w:r>
     </w:p>
     <w:p>
@@ -2223,7 +2213,7 @@
         </w:numPr>
       </w:pPr>
       <w:r>
-        <w:t>Investment returns are not guaranteed</w:t>
+        <w:t>Material assumptions and their basis: ______________________________</w:t>
       </w:r>
     </w:p>
     <w:p>
@@ -2235,7 +2225,7 @@
         </w:numPr>
       </w:pPr>
       <w:r>
-        <w:t>Past performance does not predict future results</w:t>
+        <w:t>Exact values not supplied: ______________________________</w:t>
       </w:r>
     </w:p>
     <w:p>
@@ -2247,7 +2237,7 @@
         </w:numPr>
       </w:pPr>
       <w:r>
-        <w:t>My investment goals may require periodic review and adjustment</w:t>
+        <w:t>Policy choices that would change if an assumption is wrong: ______________________________</w:t>
       </w:r>
     </w:p>
     <w:p>
@@ -2259,7 +2249,7 @@
         </w:numPr>
       </w:pPr>
       <w:r>
-        <w:t>Market conditions may require tactical adjustments to this policy</w:t>
+        <w:t>Next review trigger or condition: ______________________________</w:t>
       </w:r>
     </w:p>
     <w:p>
@@ -2271,33 +2261,28 @@
         </w:numPr>
       </w:pPr>
       <w:r>
-        <w:t>Regular communication with my advisor is essential for success"</w:t>
-      </w:r>
-    </w:p>
-    <w:p>
-      <w:pPr>
-        <w:pStyle w:val="FirstParagraph"/>
-      </w:pPr>
-      <w:r>
-        <w:rPr>
-          <w:b/>
-          <w:bCs/>
-        </w:rPr>
-        <w:t>Client Signature:</w:t>
-      </w:r>
-      <w:r>
-        <w:t xml:space="preserve"> _________________________ </w:t>
-      </w:r>
-      <w:r>
-        <w:rPr>
-          <w:b/>
-          <w:bCs/>
-        </w:rPr>
-        <w:t>Date:</w:t>
-      </w:r>
-      <w:r>
-        <w:t xml:space="preserve"> _________</w:t>
-      </w:r>
+        <w:t>Gate 1 decision reference: ______________________________</w:t>
+      </w:r>
+    </w:p>
+    <w:p>
+      <w:pPr>
+        <w:pStyle w:val="FirstParagraph"/>
+      </w:pPr>
+      <w:r>
+        <w:rPr>
+          <w:b/>
+          <w:bCs/>
+        </w:rPr>
+        <w:t>Client signature: Not part of the course simulation</w:t>
+      </w:r>
+      <w:r/>
+      <w:r>
+        <w:rPr>
+          <w:b/>
+          <w:bCs/>
+        </w:rPr>
+      </w:r>
+      <w:r/>
     </w:p>
     <w:p>
       <w:pPr>
@@ -2308,21 +2293,16 @@
           <w:b/>
           <w:bCs/>
         </w:rPr>
-        <w:t>Advisor Signature:</w:t>
-      </w:r>
-      <w:r>
-        <w:t xml:space="preserve"> _________________________ </w:t>
-      </w:r>
-      <w:r>
-        <w:rPr>
-          <w:b/>
-          <w:bCs/>
-        </w:rPr>
-        <w:t>Date:</w:t>
-      </w:r>
-      <w:r>
-        <w:t xml:space="preserve"> _________</w:t>
-      </w:r>
+        <w:t>Committee approval: Record each team member’s vote in the Decision Record</w:t>
+      </w:r>
+      <w:r/>
+      <w:r>
+        <w:rPr>
+          <w:b/>
+          <w:bCs/>
+        </w:rPr>
+      </w:r>
+      <w:r/>
     </w:p>
     <w:p>
       <w:r>

</xml_diff>